<commit_message>
SEO report: live check after batch 2, Search Console table for the 13 categories, free-shipping finding
Co-Authored-By: Claude Fable 5.1 <noreply@anthropic.com>
Claude-Session: https://claude.ai/code/session_01WQdV3gTwaa8gL1qhw2T88o
</commit_message>
<xml_diff>
--- a/docs/The-Art-Framer-USA-SEO-Report.docx
+++ b/docs/The-Art-Framer-USA-SEO-Report.docx
@@ -33,7 +33,7 @@
     <w:p>
       <w:pPr/>
       <w:r>
-        <w:t xml:space="preserve">All USA-market SEO work that can be done in code is complete: about 80% has been live on theartframer.us and YouTube since 14 Oct, and the remaining 20% was approved and merged at 09:49 UTC on 15 Oct and is deploying now; the live verification is recorded at the end of this report once the deploy completes. After that merge, what is left is owner work only: publish eight draft articles, clear one YouTube title lock, supply the studio address, and collect reviews.</w:t>
+        <w:t xml:space="preserve">All USA-market SEO work that can be done in code is complete: about 80% has been live on theartframer.us and YouTube since 14 Oct, and the remaining 20% was merged at 09:49 UTC on 15 Oct and verified live at 10:10 UTC. One item failed that check: the "free shipping" wording was still in 36 places because the deploy itself kept restoring it; the cause is fixed in pull request 403, which waits for the owner to merge. After that merge, what is left is owner work only: merge pull request 403, press Request Indexing on four categories, publish eight draft articles, clear one YouTube title lock, supply the studio address, and collect reviews.</w:t>
       </w:r>
     </w:p>
     <w:tbl>
@@ -2044,6 +2044,986 @@
       <w:pPr/>
       <w:r>
         <w:t xml:space="preserve">Sources: live-database inventories from the Run Diagnostic workflow (runs 98, 101 and 105), Search Console URL Inspection screenshots and the Search Console API pull of 14 Oct, YouTube Data API reads before and after each apply, and pull requests 397 and 402 in the postero-child repository.</w:t>
+      </w:r>
+    </w:p>
+    <w:p>
+      <w:pPr>
+        <w:pStyle w:val="Heading2"/>
+      </w:pPr>
+      <w:r>
+        <w:t xml:space="preserve">Live verification after the second deploy, 15 Oct 10:10 UTC</w:t>
+      </w:r>
+    </w:p>
+    <w:p>
+      <w:pPr/>
+      <w:r>
+        <w:t xml:space="preserve">The deploy for pull request 402 succeeded at 10:05 UTC, and a read-only check run on the server itself confirms the link row, the sitemap and the eight drafts are delivered. One check failed: 36 places in the database still said "free shipping" or "free delivery", down from 49. The deploy itself was putting the words back. A restore script added on 5 Oct (after the rewrite's earlier save method damaged page markup) ran later in every deploy and restored each page and Elementor design from its pre-rewrite backup, and three deploy scripts carried the sentences and re-applied them. Pull request 403 removes the restore step, makes the rewrite write directly and match the text as Elementor stores it, clears Elementor's render caches and fixes the wording in the scripts. It waits for the owner to merge; the count should then be 0.</w:t>
+      </w:r>
+    </w:p>
+    <w:tbl>
+      <w:tblPr>
+        <w:tblStyle w:val="TableGrid"/>
+        <w:tblW w:w="0" w:type="auto"/>
+        <w:tblLayout w:type="fixed"/>
+        <w:tblLook w:val="04A0" w:firstRow="1" w:lastRow="0" w:firstColumn="0" w:lastColumn="0" w:noHBand="0" w:noVBand="1"/>
+      </w:tblPr>
+      <w:tblGrid>
+        <w:gridCol w:w="4680"/>
+        <w:gridCol w:w="4680"/>
+      </w:tblGrid>
+      <w:tr>
+        <w:trPr>
+          <w:tblHeader/>
+        </w:trPr>
+        <w:tc>
+          <w:tcPr>
+            <w:tcW w:w="4680" w:type="dxa"/>
+            <w:shd w:val="clear" w:color="auto" w:fill="F2F2F2"/>
+          </w:tcPr>
+          <w:p>
+            <w:pPr/>
+            <w:r>
+              <w:t xml:space="preserve">Check</w:t>
+            </w:r>
+          </w:p>
+        </w:tc>
+        <w:tc>
+          <w:tcPr>
+            <w:tcW w:w="4680" w:type="dxa"/>
+            <w:shd w:val="clear" w:color="auto" w:fill="F2F2F2"/>
+          </w:tcPr>
+          <w:p>
+            <w:pPr/>
+            <w:r>
+              <w:t xml:space="preserve">Result</w:t>
+            </w:r>
+          </w:p>
+        </w:tc>
+      </w:tr>
+      <w:tr>
+        <w:tc>
+          <w:tcPr>
+            <w:tcW w:w="4680" w:type="dxa"/>
+          </w:tcPr>
+          <w:p>
+            <w:pPr/>
+            <w:r>
+              <w:t xml:space="preserve">Deity link module loaded, 13 categories resolved</w:t>
+            </w:r>
+          </w:p>
+        </w:tc>
+        <w:tc>
+          <w:tcPr>
+            <w:tcW w:w="4680" w:type="dxa"/>
+          </w:tcPr>
+          <w:p>
+            <w:pPr/>
+            <w:r>
+              <w:t xml:space="preserve">Yes, all 13 with live URLs</w:t>
+            </w:r>
+          </w:p>
+        </w:tc>
+      </w:tr>
+      <w:tr>
+        <w:tc>
+          <w:tcPr>
+            <w:tcW w:w="4680" w:type="dxa"/>
+          </w:tcPr>
+          <w:p>
+            <w:pPr/>
+            <w:r>
+              <w:t xml:space="preserve">"Shop by Deity &amp; Vastu" row on the Lakshmi Ganesha category page</w:t>
+            </w:r>
+          </w:p>
+        </w:tc>
+        <w:tc>
+          <w:tcPr>
+            <w:tcW w:w="4680" w:type="dxa"/>
+          </w:tcPr>
+          <w:p>
+            <w:pPr/>
+            <w:r>
+              <w:t xml:space="preserve">Present, 88 deity category links in the page</w:t>
+            </w:r>
+          </w:p>
+        </w:tc>
+      </w:tr>
+      <w:tr>
+        <w:tc>
+          <w:tcPr>
+            <w:tcW w:w="4680" w:type="dxa"/>
+          </w:tcPr>
+          <w:p>
+            <w:pPr/>
+            <w:r>
+              <w:t xml:space="preserve">Row on the shop page</w:t>
+            </w:r>
+          </w:p>
+        </w:tc>
+        <w:tc>
+          <w:tcPr>
+            <w:tcW w:w="4680" w:type="dxa"/>
+          </w:tcPr>
+          <w:p>
+            <w:pPr/>
+            <w:r>
+              <w:t xml:space="preserve">Present, 48 links</w:t>
+            </w:r>
+          </w:p>
+        </w:tc>
+      </w:tr>
+      <w:tr>
+        <w:tc>
+          <w:tcPr>
+            <w:tcW w:w="4680" w:type="dxa"/>
+          </w:tcPr>
+          <w:p>
+            <w:pPr/>
+            <w:r>
+              <w:t xml:space="preserve">Row on the home page</w:t>
+            </w:r>
+          </w:p>
+        </w:tc>
+        <w:tc>
+          <w:tcPr>
+            <w:tcW w:w="4680" w:type="dxa"/>
+          </w:tcPr>
+          <w:p>
+            <w:pPr/>
+            <w:r>
+              <w:t xml:space="preserve">Present, 40 links</w:t>
+            </w:r>
+          </w:p>
+        </w:tc>
+      </w:tr>
+      <w:tr>
+        <w:tc>
+          <w:tcPr>
+            <w:tcW w:w="4680" w:type="dxa"/>
+          </w:tcPr>
+          <w:p>
+            <w:pPr/>
+            <w:r>
+              <w:t xml:space="preserve">Row on a Radha Krishna product page</w:t>
+            </w:r>
+          </w:p>
+        </w:tc>
+        <w:tc>
+          <w:tcPr>
+            <w:tcW w:w="4680" w:type="dxa"/>
+          </w:tcPr>
+          <w:p>
+            <w:pPr/>
+            <w:r>
+              <w:t xml:space="preserve">Present, 43 links</w:t>
+            </w:r>
+          </w:p>
+        </w:tc>
+      </w:tr>
+      <w:tr>
+        <w:tc>
+          <w:tcPr>
+            <w:tcW w:w="4680" w:type="dxa"/>
+          </w:tcPr>
+          <w:p>
+            <w:pPr/>
+            <w:r>
+              <w:t xml:space="preserve">"Free shipping" wording on those four pages</w:t>
+            </w:r>
+          </w:p>
+        </w:tc>
+        <w:tc>
+          <w:tcPr>
+            <w:tcW w:w="4680" w:type="dxa"/>
+          </w:tcPr>
+          <w:p>
+            <w:pPr/>
+            <w:r>
+              <w:t xml:space="preserve">None</w:t>
+            </w:r>
+          </w:p>
+        </w:tc>
+      </w:tr>
+      <w:tr>
+        <w:tc>
+          <w:tcPr>
+            <w:tcW w:w="4680" w:type="dxa"/>
+          </w:tcPr>
+          <w:p>
+            <w:pPr/>
+            <w:r>
+              <w:t xml:space="preserve">Sitemap index lists the product-category sitemap</w:t>
+            </w:r>
+          </w:p>
+        </w:tc>
+        <w:tc>
+          <w:tcPr>
+            <w:tcW w:w="4680" w:type="dxa"/>
+          </w:tcPr>
+          <w:p>
+            <w:pPr/>
+            <w:r>
+              <w:t xml:space="preserve">Yes</w:t>
+            </w:r>
+          </w:p>
+        </w:tc>
+      </w:tr>
+      <w:tr>
+        <w:tc>
+          <w:tcPr>
+            <w:tcW w:w="4680" w:type="dxa"/>
+          </w:tcPr>
+          <w:p>
+            <w:pPr/>
+            <w:r>
+              <w:t xml:space="preserve">Category sitemap lists lakshmi-ganesha and seven-horses</w:t>
+            </w:r>
+          </w:p>
+        </w:tc>
+        <w:tc>
+          <w:tcPr>
+            <w:tcW w:w="4680" w:type="dxa"/>
+          </w:tcPr>
+          <w:p>
+            <w:pPr/>
+            <w:r>
+              <w:t xml:space="preserve">Yes, both</w:t>
+            </w:r>
+          </w:p>
+        </w:tc>
+      </w:tr>
+      <w:tr>
+        <w:tc>
+          <w:tcPr>
+            <w:tcW w:w="4680" w:type="dxa"/>
+          </w:tcPr>
+          <w:p>
+            <w:pPr/>
+            <w:r>
+              <w:t xml:space="preserve">Eight articles created as drafts</w:t>
+            </w:r>
+          </w:p>
+        </w:tc>
+        <w:tc>
+          <w:tcPr>
+            <w:tcW w:w="4680" w:type="dxa"/>
+          </w:tcPr>
+          <w:p>
+            <w:pPr/>
+            <w:r>
+              <w:t xml:space="preserve">Yes, posts 35024 to 35031, all in Drafts</w:t>
+            </w:r>
+          </w:p>
+        </w:tc>
+      </w:tr>
+      <w:tr>
+        <w:tc>
+          <w:tcPr>
+            <w:tcW w:w="4680" w:type="dxa"/>
+          </w:tcPr>
+          <w:p>
+            <w:pPr/>
+            <w:r>
+              <w:t xml:space="preserve">"Free shipping" wording anywhere in the database</w:t>
+            </w:r>
+          </w:p>
+        </w:tc>
+        <w:tc>
+          <w:tcPr>
+            <w:tcW w:w="4680" w:type="dxa"/>
+          </w:tcPr>
+          <w:p>
+            <w:pPr/>
+            <w:r>
+              <w:t xml:space="preserve">Failed: 36 places (49 before). Cause found and fixed in pull request 403, awaiting merge</w:t>
+            </w:r>
+          </w:p>
+        </w:tc>
+      </w:tr>
+    </w:tbl>
+    <w:p>
+      <w:pPr>
+        <w:pStyle w:val="Heading3"/>
+      </w:pPr>
+      <w:r>
+        <w:t xml:space="preserve">Search Console on the 13 deity and Vastu categories, 15 Oct 10:14 UTC</w:t>
+      </w:r>
+    </w:p>
+    <w:p>
+      <w:pPr/>
+      <w:r>
+        <w:t xml:space="preserve">Read-only URL Inspection from the SB session, before Google had recrawled anything after the deploy (latest crawl 11 Oct). Nine of thirteen are indexed and the canonical matches on all thirteen.</w:t>
+      </w:r>
+    </w:p>
+    <w:tbl>
+      <w:tblPr>
+        <w:tblStyle w:val="TableGrid"/>
+        <w:tblW w:w="0" w:type="auto"/>
+        <w:tblLayout w:type="fixed"/>
+        <w:tblLook w:val="04A0" w:firstRow="1" w:lastRow="0" w:firstColumn="0" w:lastColumn="0" w:noHBand="0" w:noVBand="1"/>
+      </w:tblPr>
+      <w:tblGrid>
+        <w:gridCol w:w="2340"/>
+        <w:gridCol w:w="2340"/>
+        <w:gridCol w:w="2340"/>
+        <w:gridCol w:w="2340"/>
+      </w:tblGrid>
+      <w:tr>
+        <w:trPr>
+          <w:tblHeader/>
+        </w:trPr>
+        <w:tc>
+          <w:tcPr>
+            <w:tcW w:w="2340" w:type="dxa"/>
+            <w:shd w:val="clear" w:color="auto" w:fill="F2F2F2"/>
+          </w:tcPr>
+          <w:p>
+            <w:pPr/>
+            <w:r>
+              <w:t xml:space="preserve">Category</w:t>
+            </w:r>
+          </w:p>
+        </w:tc>
+        <w:tc>
+          <w:tcPr>
+            <w:tcW w:w="2340" w:type="dxa"/>
+            <w:shd w:val="clear" w:color="auto" w:fill="F2F2F2"/>
+          </w:tcPr>
+          <w:p>
+            <w:pPr/>
+            <w:r>
+              <w:t xml:space="preserve">Coverage</w:t>
+            </w:r>
+          </w:p>
+        </w:tc>
+        <w:tc>
+          <w:tcPr>
+            <w:tcW w:w="2340" w:type="dxa"/>
+            <w:shd w:val="clear" w:color="auto" w:fill="F2F2F2"/>
+          </w:tcPr>
+          <w:p>
+            <w:pPr/>
+            <w:r>
+              <w:t xml:space="preserve">Last crawl</w:t>
+            </w:r>
+          </w:p>
+        </w:tc>
+        <w:tc>
+          <w:tcPr>
+            <w:tcW w:w="2340" w:type="dxa"/>
+            <w:shd w:val="clear" w:color="auto" w:fill="F2F2F2"/>
+          </w:tcPr>
+          <w:p>
+            <w:pPr/>
+            <w:r>
+              <w:t xml:space="preserve">In sitemap, per Google</w:t>
+            </w:r>
+          </w:p>
+        </w:tc>
+      </w:tr>
+      <w:tr>
+        <w:tc>
+          <w:tcPr>
+            <w:tcW w:w="2340" w:type="dxa"/>
+          </w:tcPr>
+          <w:p>
+            <w:pPr/>
+            <w:r>
+              <w:t xml:space="preserve">hindu-deities</w:t>
+            </w:r>
+          </w:p>
+        </w:tc>
+        <w:tc>
+          <w:tcPr>
+            <w:tcW w:w="2340" w:type="dxa"/>
+          </w:tcPr>
+          <w:p>
+            <w:pPr/>
+            <w:r>
+              <w:t xml:space="preserve">Submitted and indexed</w:t>
+            </w:r>
+          </w:p>
+        </w:tc>
+        <w:tc>
+          <w:tcPr>
+            <w:tcW w:w="2340" w:type="dxa"/>
+          </w:tcPr>
+          <w:p>
+            <w:pPr/>
+            <w:r>
+              <w:t xml:space="preserve">9 Oct</w:t>
+            </w:r>
+          </w:p>
+        </w:tc>
+        <w:tc>
+          <w:tcPr>
+            <w:tcW w:w="2340" w:type="dxa"/>
+          </w:tcPr>
+          <w:p>
+            <w:pPr/>
+            <w:r>
+              <w:t xml:space="preserve">yes</w:t>
+            </w:r>
+          </w:p>
+        </w:tc>
+      </w:tr>
+      <w:tr>
+        <w:tc>
+          <w:tcPr>
+            <w:tcW w:w="2340" w:type="dxa"/>
+          </w:tcPr>
+          <w:p>
+            <w:pPr/>
+            <w:r>
+              <w:t xml:space="preserve">radha-krishna</w:t>
+            </w:r>
+          </w:p>
+        </w:tc>
+        <w:tc>
+          <w:tcPr>
+            <w:tcW w:w="2340" w:type="dxa"/>
+          </w:tcPr>
+          <w:p>
+            <w:pPr/>
+            <w:r>
+              <w:t xml:space="preserve">Submitted and indexed</w:t>
+            </w:r>
+          </w:p>
+        </w:tc>
+        <w:tc>
+          <w:tcPr>
+            <w:tcW w:w="2340" w:type="dxa"/>
+          </w:tcPr>
+          <w:p>
+            <w:pPr/>
+            <w:r>
+              <w:t xml:space="preserve">11 Oct</w:t>
+            </w:r>
+          </w:p>
+        </w:tc>
+        <w:tc>
+          <w:tcPr>
+            <w:tcW w:w="2340" w:type="dxa"/>
+          </w:tcPr>
+          <w:p>
+            <w:pPr/>
+            <w:r>
+              <w:t xml:space="preserve">no</w:t>
+            </w:r>
+          </w:p>
+        </w:tc>
+      </w:tr>
+      <w:tr>
+        <w:tc>
+          <w:tcPr>
+            <w:tcW w:w="2340" w:type="dxa"/>
+          </w:tcPr>
+          <w:p>
+            <w:pPr/>
+            <w:r>
+              <w:t xml:space="preserve">lakshmi-ganesha</w:t>
+            </w:r>
+          </w:p>
+        </w:tc>
+        <w:tc>
+          <w:tcPr>
+            <w:tcW w:w="2340" w:type="dxa"/>
+          </w:tcPr>
+          <w:p>
+            <w:pPr/>
+            <w:r>
+              <w:t xml:space="preserve">Discovered, currently not indexed</w:t>
+            </w:r>
+          </w:p>
+        </w:tc>
+        <w:tc>
+          <w:tcPr>
+            <w:tcW w:w="2340" w:type="dxa"/>
+          </w:tcPr>
+          <w:p>
+            <w:pPr/>
+            <w:r>
+              <w:t xml:space="preserve">never</w:t>
+            </w:r>
+          </w:p>
+        </w:tc>
+        <w:tc>
+          <w:tcPr>
+            <w:tcW w:w="2340" w:type="dxa"/>
+          </w:tcPr>
+          <w:p>
+            <w:pPr/>
+            <w:r>
+              <w:t xml:space="preserve">yes</w:t>
+            </w:r>
+          </w:p>
+        </w:tc>
+      </w:tr>
+      <w:tr>
+        <w:tc>
+          <w:tcPr>
+            <w:tcW w:w="2340" w:type="dxa"/>
+          </w:tcPr>
+          <w:p>
+            <w:pPr/>
+            <w:r>
+              <w:t xml:space="preserve">lord-shiva</w:t>
+            </w:r>
+          </w:p>
+        </w:tc>
+        <w:tc>
+          <w:tcPr>
+            <w:tcW w:w="2340" w:type="dxa"/>
+          </w:tcPr>
+          <w:p>
+            <w:pPr/>
+            <w:r>
+              <w:t xml:space="preserve">Crawled, currently not indexed</w:t>
+            </w:r>
+          </w:p>
+        </w:tc>
+        <w:tc>
+          <w:tcPr>
+            <w:tcW w:w="2340" w:type="dxa"/>
+          </w:tcPr>
+          <w:p>
+            <w:pPr/>
+            <w:r>
+              <w:t xml:space="preserve">9 Jul</w:t>
+            </w:r>
+          </w:p>
+        </w:tc>
+        <w:tc>
+          <w:tcPr>
+            <w:tcW w:w="2340" w:type="dxa"/>
+          </w:tcPr>
+          <w:p>
+            <w:pPr/>
+            <w:r>
+              <w:t xml:space="preserve">no</w:t>
+            </w:r>
+          </w:p>
+        </w:tc>
+      </w:tr>
+      <w:tr>
+        <w:tc>
+          <w:tcPr>
+            <w:tcW w:w="2340" w:type="dxa"/>
+          </w:tcPr>
+          <w:p>
+            <w:pPr/>
+            <w:r>
+              <w:t xml:space="preserve">seven-horses</w:t>
+            </w:r>
+          </w:p>
+        </w:tc>
+        <w:tc>
+          <w:tcPr>
+            <w:tcW w:w="2340" w:type="dxa"/>
+          </w:tcPr>
+          <w:p>
+            <w:pPr/>
+            <w:r>
+              <w:t xml:space="preserve">Submitted and indexed</w:t>
+            </w:r>
+          </w:p>
+        </w:tc>
+        <w:tc>
+          <w:tcPr>
+            <w:tcW w:w="2340" w:type="dxa"/>
+          </w:tcPr>
+          <w:p>
+            <w:pPr/>
+            <w:r>
+              <w:t xml:space="preserve">6 Oct</w:t>
+            </w:r>
+          </w:p>
+        </w:tc>
+        <w:tc>
+          <w:tcPr>
+            <w:tcW w:w="2340" w:type="dxa"/>
+          </w:tcPr>
+          <w:p>
+            <w:pPr/>
+            <w:r>
+              <w:t xml:space="preserve">yes</w:t>
+            </w:r>
+          </w:p>
+        </w:tc>
+      </w:tr>
+      <w:tr>
+        <w:tc>
+          <w:tcPr>
+            <w:tcW w:w="2340" w:type="dxa"/>
+          </w:tcPr>
+          <w:p>
+            <w:pPr/>
+            <w:r>
+              <w:t xml:space="preserve">vaastu-art</w:t>
+            </w:r>
+          </w:p>
+        </w:tc>
+        <w:tc>
+          <w:tcPr>
+            <w:tcW w:w="2340" w:type="dxa"/>
+          </w:tcPr>
+          <w:p>
+            <w:pPr/>
+            <w:r>
+              <w:t xml:space="preserve">Submitted and indexed</w:t>
+            </w:r>
+          </w:p>
+        </w:tc>
+        <w:tc>
+          <w:tcPr>
+            <w:tcW w:w="2340" w:type="dxa"/>
+          </w:tcPr>
+          <w:p>
+            <w:pPr/>
+            <w:r>
+              <w:t xml:space="preserve">3 Oct</w:t>
+            </w:r>
+          </w:p>
+        </w:tc>
+        <w:tc>
+          <w:tcPr>
+            <w:tcW w:w="2340" w:type="dxa"/>
+          </w:tcPr>
+          <w:p>
+            <w:pPr/>
+            <w:r>
+              <w:t xml:space="preserve">yes</w:t>
+            </w:r>
+          </w:p>
+        </w:tc>
+      </w:tr>
+      <w:tr>
+        <w:tc>
+          <w:tcPr>
+            <w:tcW w:w="2340" w:type="dxa"/>
+          </w:tcPr>
+          <w:p>
+            <w:pPr/>
+            <w:r>
+              <w:t xml:space="preserve">tirupati-balaji</w:t>
+            </w:r>
+          </w:p>
+        </w:tc>
+        <w:tc>
+          <w:tcPr>
+            <w:tcW w:w="2340" w:type="dxa"/>
+          </w:tcPr>
+          <w:p>
+            <w:pPr/>
+            <w:r>
+              <w:t xml:space="preserve">Discovered, currently not indexed</w:t>
+            </w:r>
+          </w:p>
+        </w:tc>
+        <w:tc>
+          <w:tcPr>
+            <w:tcW w:w="2340" w:type="dxa"/>
+          </w:tcPr>
+          <w:p>
+            <w:pPr/>
+            <w:r>
+              <w:t xml:space="preserve">never</w:t>
+            </w:r>
+          </w:p>
+        </w:tc>
+        <w:tc>
+          <w:tcPr>
+            <w:tcW w:w="2340" w:type="dxa"/>
+          </w:tcPr>
+          <w:p>
+            <w:pPr/>
+            <w:r>
+              <w:t xml:space="preserve">yes</w:t>
+            </w:r>
+          </w:p>
+        </w:tc>
+      </w:tr>
+      <w:tr>
+        <w:tc>
+          <w:tcPr>
+            <w:tcW w:w="2340" w:type="dxa"/>
+          </w:tcPr>
+          <w:p>
+            <w:pPr/>
+            <w:r>
+              <w:t xml:space="preserve">lord-rama</w:t>
+            </w:r>
+          </w:p>
+        </w:tc>
+        <w:tc>
+          <w:tcPr>
+            <w:tcW w:w="2340" w:type="dxa"/>
+          </w:tcPr>
+          <w:p>
+            <w:pPr/>
+            <w:r>
+              <w:t xml:space="preserve">Submitted and indexed</w:t>
+            </w:r>
+          </w:p>
+        </w:tc>
+        <w:tc>
+          <w:tcPr>
+            <w:tcW w:w="2340" w:type="dxa"/>
+          </w:tcPr>
+          <w:p>
+            <w:pPr/>
+            <w:r>
+              <w:t xml:space="preserve">3 Oct</w:t>
+            </w:r>
+          </w:p>
+        </w:tc>
+        <w:tc>
+          <w:tcPr>
+            <w:tcW w:w="2340" w:type="dxa"/>
+          </w:tcPr>
+          <w:p>
+            <w:pPr/>
+            <w:r>
+              <w:t xml:space="preserve">yes</w:t>
+            </w:r>
+          </w:p>
+        </w:tc>
+      </w:tr>
+      <w:tr>
+        <w:tc>
+          <w:tcPr>
+            <w:tcW w:w="2340" w:type="dxa"/>
+          </w:tcPr>
+          <w:p>
+            <w:pPr/>
+            <w:r>
+              <w:t xml:space="preserve">buddha</w:t>
+            </w:r>
+          </w:p>
+        </w:tc>
+        <w:tc>
+          <w:tcPr>
+            <w:tcW w:w="2340" w:type="dxa"/>
+          </w:tcPr>
+          <w:p>
+            <w:pPr/>
+            <w:r>
+              <w:t xml:space="preserve">Submitted and indexed</w:t>
+            </w:r>
+          </w:p>
+        </w:tc>
+        <w:tc>
+          <w:tcPr>
+            <w:tcW w:w="2340" w:type="dxa"/>
+          </w:tcPr>
+          <w:p>
+            <w:pPr/>
+            <w:r>
+              <w:t xml:space="preserve">28 Sep</w:t>
+            </w:r>
+          </w:p>
+        </w:tc>
+        <w:tc>
+          <w:tcPr>
+            <w:tcW w:w="2340" w:type="dxa"/>
+          </w:tcPr>
+          <w:p>
+            <w:pPr/>
+            <w:r>
+              <w:t xml:space="preserve">yes</w:t>
+            </w:r>
+          </w:p>
+        </w:tc>
+      </w:tr>
+      <w:tr>
+        <w:tc>
+          <w:tcPr>
+            <w:tcW w:w="2340" w:type="dxa"/>
+          </w:tcPr>
+          <w:p>
+            <w:pPr/>
+            <w:r>
+              <w:t xml:space="preserve">sikh-art</w:t>
+            </w:r>
+          </w:p>
+        </w:tc>
+        <w:tc>
+          <w:tcPr>
+            <w:tcW w:w="2340" w:type="dxa"/>
+          </w:tcPr>
+          <w:p>
+            <w:pPr/>
+            <w:r>
+              <w:t xml:space="preserve">Submitted and indexed</w:t>
+            </w:r>
+          </w:p>
+        </w:tc>
+        <w:tc>
+          <w:tcPr>
+            <w:tcW w:w="2340" w:type="dxa"/>
+          </w:tcPr>
+          <w:p>
+            <w:pPr/>
+            <w:r>
+              <w:t xml:space="preserve">23 Sep</w:t>
+            </w:r>
+          </w:p>
+        </w:tc>
+        <w:tc>
+          <w:tcPr>
+            <w:tcW w:w="2340" w:type="dxa"/>
+          </w:tcPr>
+          <w:p>
+            <w:pPr/>
+            <w:r>
+              <w:t xml:space="preserve">yes</w:t>
+            </w:r>
+          </w:p>
+        </w:tc>
+      </w:tr>
+      <w:tr>
+        <w:tc>
+          <w:tcPr>
+            <w:tcW w:w="2340" w:type="dxa"/>
+          </w:tcPr>
+          <w:p>
+            <w:pPr/>
+            <w:r>
+              <w:t xml:space="preserve">swaminarayan</w:t>
+            </w:r>
+          </w:p>
+        </w:tc>
+        <w:tc>
+          <w:tcPr>
+            <w:tcW w:w="2340" w:type="dxa"/>
+          </w:tcPr>
+          <w:p>
+            <w:pPr/>
+            <w:r>
+              <w:t xml:space="preserve">Crawled, currently not indexed</w:t>
+            </w:r>
+          </w:p>
+        </w:tc>
+        <w:tc>
+          <w:tcPr>
+            <w:tcW w:w="2340" w:type="dxa"/>
+          </w:tcPr>
+          <w:p>
+            <w:pPr/>
+            <w:r>
+              <w:t xml:space="preserve">24 May</w:t>
+            </w:r>
+          </w:p>
+        </w:tc>
+        <w:tc>
+          <w:tcPr>
+            <w:tcW w:w="2340" w:type="dxa"/>
+          </w:tcPr>
+          <w:p>
+            <w:pPr/>
+            <w:r>
+              <w:t xml:space="preserve">no</w:t>
+            </w:r>
+          </w:p>
+        </w:tc>
+      </w:tr>
+      <w:tr>
+        <w:tc>
+          <w:tcPr>
+            <w:tcW w:w="2340" w:type="dxa"/>
+          </w:tcPr>
+          <w:p>
+            <w:pPr/>
+            <w:r>
+              <w:t xml:space="preserve">pichwai-art</w:t>
+            </w:r>
+          </w:p>
+        </w:tc>
+        <w:tc>
+          <w:tcPr>
+            <w:tcW w:w="2340" w:type="dxa"/>
+          </w:tcPr>
+          <w:p>
+            <w:pPr/>
+            <w:r>
+              <w:t xml:space="preserve">Submitted and indexed</w:t>
+            </w:r>
+          </w:p>
+        </w:tc>
+        <w:tc>
+          <w:tcPr>
+            <w:tcW w:w="2340" w:type="dxa"/>
+          </w:tcPr>
+          <w:p>
+            <w:pPr/>
+            <w:r>
+              <w:t xml:space="preserve">2 Oct</w:t>
+            </w:r>
+          </w:p>
+        </w:tc>
+        <w:tc>
+          <w:tcPr>
+            <w:tcW w:w="2340" w:type="dxa"/>
+          </w:tcPr>
+          <w:p>
+            <w:pPr/>
+            <w:r>
+              <w:t xml:space="preserve">yes</w:t>
+            </w:r>
+          </w:p>
+        </w:tc>
+      </w:tr>
+      <w:tr>
+        <w:tc>
+          <w:tcPr>
+            <w:tcW w:w="2340" w:type="dxa"/>
+          </w:tcPr>
+          <w:p>
+            <w:pPr/>
+            <w:r>
+              <w:t xml:space="preserve">indian-culture</w:t>
+            </w:r>
+          </w:p>
+        </w:tc>
+        <w:tc>
+          <w:tcPr>
+            <w:tcW w:w="2340" w:type="dxa"/>
+          </w:tcPr>
+          <w:p>
+            <w:pPr/>
+            <w:r>
+              <w:t xml:space="preserve">Submitted and indexed</w:t>
+            </w:r>
+          </w:p>
+        </w:tc>
+        <w:tc>
+          <w:tcPr>
+            <w:tcW w:w="2340" w:type="dxa"/>
+          </w:tcPr>
+          <w:p>
+            <w:pPr/>
+            <w:r>
+              <w:t xml:space="preserve">4 Oct</w:t>
+            </w:r>
+          </w:p>
+        </w:tc>
+        <w:tc>
+          <w:tcPr>
+            <w:tcW w:w="2340" w:type="dxa"/>
+          </w:tcPr>
+          <w:p>
+            <w:pPr/>
+            <w:r>
+              <w:t xml:space="preserve">no</w:t>
+            </w:r>
+          </w:p>
+        </w:tc>
+      </w:tr>
+    </w:tbl>
+    <w:p>
+      <w:pPr/>
+      <w:r>
+        <w:t xml:space="preserve">The four that are not indexed need the owner to press Request Indexing in Search Console: Lakshmi Ganesha, Tirupati Balaji, Lord Shiva and Swaminarayan. What Search Console shows for a page is Google's last memory of it, which for these pages dates from before the changes. It updates only after Google crawls the page again, which the sitemap, the new internal links and a manual "Request indexing" each prompt. Expect the verdicts to change over the next one to four weeks.</w:t>
       </w:r>
     </w:p>
     <w:sectPr>

</xml_diff>